<commit_message>
changed documentation and README.md file
</commit_message>
<xml_diff>
--- a/Project_Documentation.docx
+++ b/Project_Documentation.docx
@@ -2333,14 +2333,138 @@
         <w:rPr>
           <w:rFonts w:ascii="Times New Roman" w:hAnsi="Times New Roman" w:cs="Times New Roman"/>
         </w:rPr>
-        <w:pict w14:anchorId="7806F4C4">
-          <v:rect id="_x0000_i1042" style="width:0;height:1.5pt" o:hralign="center" o:hrstd="t" o:hr="t" fillcolor="#a0a0a0" stroked="f"/>
+        <w:pict w14:anchorId="2C8B814A">
+          <v:rect id="_x0000_i1069" style="width:0;height:1.5pt" o:hralign="center" o:hrstd="t" o:hr="t" fillcolor="#a0a0a0" stroked="f"/>
         </w:pict>
       </w:r>
     </w:p>
     <w:p>
       <w:pPr>
         <w:rPr>
+          <w:rFonts w:ascii="Segoe UI Emoji" w:hAnsi="Segoe UI Emoji" w:cs="Segoe UI Emoji"/>
+          <w:b/>
+          <w:bCs/>
+        </w:rPr>
+      </w:pPr>
+    </w:p>
+    <w:p>
+      <w:pPr>
+        <w:rPr>
+          <w:rFonts w:ascii="Times New Roman" w:hAnsi="Times New Roman" w:cs="Times New Roman"/>
+        </w:rPr>
+      </w:pPr>
+      <w:r>
+        <w:rPr>
+          <w:rFonts w:ascii="Segoe UI Emoji" w:hAnsi="Segoe UI Emoji" w:cs="Segoe UI Emoji"/>
+          <w:b/>
+          <w:bCs/>
+        </w:rPr>
+        <w:lastRenderedPageBreak/>
+        <w:t>⚠️</w:t>
+      </w:r>
+      <w:r>
+        <w:rPr>
+          <w:rFonts w:ascii="Times New Roman" w:hAnsi="Times New Roman" w:cs="Times New Roman"/>
+          <w:b/>
+          <w:bCs/>
+        </w:rPr>
+        <w:t xml:space="preserve"> </w:t>
+      </w:r>
+      <w:r>
+        <w:rPr>
+          <w:rFonts w:ascii="Times New Roman" w:hAnsi="Times New Roman" w:cs="Times New Roman"/>
+          <w:b/>
+          <w:bCs/>
+        </w:rPr>
+        <w:t xml:space="preserve">Challenge </w:t>
+      </w:r>
+      <w:r>
+        <w:rPr>
+          <w:rFonts w:ascii="Times New Roman" w:hAnsi="Times New Roman" w:cs="Times New Roman"/>
+          <w:b/>
+          <w:bCs/>
+        </w:rPr>
+        <w:t>5</w:t>
+      </w:r>
+      <w:r>
+        <w:rPr>
+          <w:rFonts w:ascii="Times New Roman" w:hAnsi="Times New Roman" w:cs="Times New Roman"/>
+          <w:b/>
+          <w:bCs/>
+        </w:rPr>
+        <w:t xml:space="preserve">:  </w:t>
+      </w:r>
+      <w:r>
+        <w:rPr>
+          <w:rFonts w:ascii="Times New Roman" w:hAnsi="Times New Roman" w:cs="Times New Roman"/>
+        </w:rPr>
+        <w:t xml:space="preserve">Swagger </w:t>
+      </w:r>
+      <w:proofErr w:type="spellStart"/>
+      <w:r>
+        <w:rPr>
+          <w:rFonts w:ascii="Times New Roman" w:hAnsi="Times New Roman" w:cs="Times New Roman"/>
+        </w:rPr>
+        <w:t>Petstore</w:t>
+      </w:r>
+      <w:proofErr w:type="spellEnd"/>
+      <w:r>
+        <w:rPr>
+          <w:rFonts w:ascii="Times New Roman" w:hAnsi="Times New Roman" w:cs="Times New Roman"/>
+        </w:rPr>
+        <w:t xml:space="preserve"> API is NOT reliable</w:t>
+      </w:r>
+    </w:p>
+    <w:p>
+      <w:pPr>
+        <w:pStyle w:val="ListParagraph"/>
+        <w:numPr>
+          <w:ilvl w:val="0"/>
+          <w:numId w:val="15"/>
+        </w:numPr>
+        <w:rPr>
+          <w:rFonts w:ascii="Times New Roman" w:hAnsi="Times New Roman" w:cs="Times New Roman"/>
+        </w:rPr>
+      </w:pPr>
+      <w:r>
+        <w:rPr>
+          <w:rFonts w:ascii="Times New Roman" w:hAnsi="Times New Roman" w:cs="Times New Roman"/>
+        </w:rPr>
+        <w:t xml:space="preserve">Faced inconsistent API responses from the Swagger </w:t>
+      </w:r>
+      <w:proofErr w:type="spellStart"/>
+      <w:r>
+        <w:rPr>
+          <w:rFonts w:ascii="Times New Roman" w:hAnsi="Times New Roman" w:cs="Times New Roman"/>
+        </w:rPr>
+        <w:t>Petstore</w:t>
+      </w:r>
+      <w:proofErr w:type="spellEnd"/>
+      <w:r>
+        <w:rPr>
+          <w:rFonts w:ascii="Times New Roman" w:hAnsi="Times New Roman" w:cs="Times New Roman"/>
+        </w:rPr>
+        <w:t>, causing mismatch in expected vs actual data.</w:t>
+      </w:r>
+    </w:p>
+    <w:p>
+      <w:pPr>
+        <w:rPr>
+          <w:rFonts w:ascii="Times New Roman" w:hAnsi="Times New Roman" w:cs="Times New Roman"/>
+        </w:rPr>
+      </w:pPr>
+      <w:r>
+        <w:rPr>
+          <w:rFonts w:ascii="Times New Roman" w:hAnsi="Times New Roman" w:cs="Times New Roman"/>
+        </w:rPr>
+        <w:pict w14:anchorId="7815D774">
+          <v:rect id="_x0000_i1073" style="width:0;height:1.5pt" o:hralign="center" o:hrstd="t" o:hr="t" fillcolor="#a0a0a0" stroked="f"/>
+        </w:pict>
+      </w:r>
+    </w:p>
+    <w:p>
+      <w:pPr>
+        <w:rPr>
           <w:rFonts w:ascii="Times New Roman" w:hAnsi="Times New Roman" w:cs="Times New Roman"/>
           <w:b/>
           <w:bCs/>
@@ -2369,7 +2493,6 @@
           <w:b/>
           <w:bCs/>
         </w:rPr>
-        <w:lastRenderedPageBreak/>
         <w:t>🎯</w:t>
       </w:r>
       <w:r>
@@ -4136,6 +4259,119 @@
     </w:lvl>
   </w:abstractNum>
   <w:abstractNum w:abstractNumId="10" w15:restartNumberingAfterBreak="0">
+    <w:nsid w:val="469E5A21"/>
+    <w:multiLevelType w:val="hybridMultilevel"/>
+    <w:tmpl w:val="D0107AB8"/>
+    <w:lvl w:ilvl="0" w:tplc="40090001">
+      <w:start w:val="1"/>
+      <w:numFmt w:val="bullet"/>
+      <w:lvlText w:val=""/>
+      <w:lvlJc w:val="left"/>
+      <w:pPr>
+        <w:ind w:left="720" w:hanging="360"/>
+      </w:pPr>
+      <w:rPr>
+        <w:rFonts w:ascii="Symbol" w:hAnsi="Symbol" w:hint="default"/>
+      </w:rPr>
+    </w:lvl>
+    <w:lvl w:ilvl="1" w:tplc="40090003" w:tentative="1">
+      <w:start w:val="1"/>
+      <w:numFmt w:val="bullet"/>
+      <w:lvlText w:val="o"/>
+      <w:lvlJc w:val="left"/>
+      <w:pPr>
+        <w:ind w:left="1440" w:hanging="360"/>
+      </w:pPr>
+      <w:rPr>
+        <w:rFonts w:ascii="Courier New" w:hAnsi="Courier New" w:cs="Courier New" w:hint="default"/>
+      </w:rPr>
+    </w:lvl>
+    <w:lvl w:ilvl="2" w:tplc="40090005" w:tentative="1">
+      <w:start w:val="1"/>
+      <w:numFmt w:val="bullet"/>
+      <w:lvlText w:val=""/>
+      <w:lvlJc w:val="left"/>
+      <w:pPr>
+        <w:ind w:left="2160" w:hanging="360"/>
+      </w:pPr>
+      <w:rPr>
+        <w:rFonts w:ascii="Wingdings" w:hAnsi="Wingdings" w:hint="default"/>
+      </w:rPr>
+    </w:lvl>
+    <w:lvl w:ilvl="3" w:tplc="40090001" w:tentative="1">
+      <w:start w:val="1"/>
+      <w:numFmt w:val="bullet"/>
+      <w:lvlText w:val=""/>
+      <w:lvlJc w:val="left"/>
+      <w:pPr>
+        <w:ind w:left="2880" w:hanging="360"/>
+      </w:pPr>
+      <w:rPr>
+        <w:rFonts w:ascii="Symbol" w:hAnsi="Symbol" w:hint="default"/>
+      </w:rPr>
+    </w:lvl>
+    <w:lvl w:ilvl="4" w:tplc="40090003" w:tentative="1">
+      <w:start w:val="1"/>
+      <w:numFmt w:val="bullet"/>
+      <w:lvlText w:val="o"/>
+      <w:lvlJc w:val="left"/>
+      <w:pPr>
+        <w:ind w:left="3600" w:hanging="360"/>
+      </w:pPr>
+      <w:rPr>
+        <w:rFonts w:ascii="Courier New" w:hAnsi="Courier New" w:cs="Courier New" w:hint="default"/>
+      </w:rPr>
+    </w:lvl>
+    <w:lvl w:ilvl="5" w:tplc="40090005" w:tentative="1">
+      <w:start w:val="1"/>
+      <w:numFmt w:val="bullet"/>
+      <w:lvlText w:val=""/>
+      <w:lvlJc w:val="left"/>
+      <w:pPr>
+        <w:ind w:left="4320" w:hanging="360"/>
+      </w:pPr>
+      <w:rPr>
+        <w:rFonts w:ascii="Wingdings" w:hAnsi="Wingdings" w:hint="default"/>
+      </w:rPr>
+    </w:lvl>
+    <w:lvl w:ilvl="6" w:tplc="40090001" w:tentative="1">
+      <w:start w:val="1"/>
+      <w:numFmt w:val="bullet"/>
+      <w:lvlText w:val=""/>
+      <w:lvlJc w:val="left"/>
+      <w:pPr>
+        <w:ind w:left="5040" w:hanging="360"/>
+      </w:pPr>
+      <w:rPr>
+        <w:rFonts w:ascii="Symbol" w:hAnsi="Symbol" w:hint="default"/>
+      </w:rPr>
+    </w:lvl>
+    <w:lvl w:ilvl="7" w:tplc="40090003" w:tentative="1">
+      <w:start w:val="1"/>
+      <w:numFmt w:val="bullet"/>
+      <w:lvlText w:val="o"/>
+      <w:lvlJc w:val="left"/>
+      <w:pPr>
+        <w:ind w:left="5760" w:hanging="360"/>
+      </w:pPr>
+      <w:rPr>
+        <w:rFonts w:ascii="Courier New" w:hAnsi="Courier New" w:cs="Courier New" w:hint="default"/>
+      </w:rPr>
+    </w:lvl>
+    <w:lvl w:ilvl="8" w:tplc="40090005" w:tentative="1">
+      <w:start w:val="1"/>
+      <w:numFmt w:val="bullet"/>
+      <w:lvlText w:val=""/>
+      <w:lvlJc w:val="left"/>
+      <w:pPr>
+        <w:ind w:left="6480" w:hanging="360"/>
+      </w:pPr>
+      <w:rPr>
+        <w:rFonts w:ascii="Wingdings" w:hAnsi="Wingdings" w:hint="default"/>
+      </w:rPr>
+    </w:lvl>
+  </w:abstractNum>
+  <w:abstractNum w:abstractNumId="11" w15:restartNumberingAfterBreak="0">
     <w:nsid w:val="49382435"/>
     <w:multiLevelType w:val="multilevel"/>
     <w:tmpl w:val="9F9A743A"/>
@@ -4284,7 +4520,7 @@
       </w:rPr>
     </w:lvl>
   </w:abstractNum>
-  <w:abstractNum w:abstractNumId="11" w15:restartNumberingAfterBreak="0">
+  <w:abstractNum w:abstractNumId="12" w15:restartNumberingAfterBreak="0">
     <w:nsid w:val="54CA21BA"/>
     <w:multiLevelType w:val="multilevel"/>
     <w:tmpl w:val="0A1660CE"/>
@@ -4433,7 +4669,7 @@
       </w:rPr>
     </w:lvl>
   </w:abstractNum>
-  <w:abstractNum w:abstractNumId="12" w15:restartNumberingAfterBreak="0">
+  <w:abstractNum w:abstractNumId="13" w15:restartNumberingAfterBreak="0">
     <w:nsid w:val="7461770B"/>
     <w:multiLevelType w:val="multilevel"/>
     <w:tmpl w:val="81C021FA"/>
@@ -4582,7 +4818,7 @@
       </w:rPr>
     </w:lvl>
   </w:abstractNum>
-  <w:abstractNum w:abstractNumId="13" w15:restartNumberingAfterBreak="0">
+  <w:abstractNum w:abstractNumId="14" w15:restartNumberingAfterBreak="0">
     <w:nsid w:val="76626D73"/>
     <w:multiLevelType w:val="multilevel"/>
     <w:tmpl w:val="2AEAAAE8"/>
@@ -4735,7 +4971,7 @@
     <w:abstractNumId w:val="4"/>
   </w:num>
   <w:num w:numId="2" w16cid:durableId="455953753">
-    <w:abstractNumId w:val="13"/>
+    <w:abstractNumId w:val="14"/>
   </w:num>
   <w:num w:numId="3" w16cid:durableId="1463116954">
     <w:abstractNumId w:val="1"/>
@@ -4759,19 +4995,22 @@
     <w:abstractNumId w:val="3"/>
   </w:num>
   <w:num w:numId="10" w16cid:durableId="1004091435">
-    <w:abstractNumId w:val="10"/>
+    <w:abstractNumId w:val="11"/>
   </w:num>
   <w:num w:numId="11" w16cid:durableId="896819512">
     <w:abstractNumId w:val="0"/>
   </w:num>
   <w:num w:numId="12" w16cid:durableId="2024279489">
-    <w:abstractNumId w:val="12"/>
+    <w:abstractNumId w:val="13"/>
   </w:num>
   <w:num w:numId="13" w16cid:durableId="696930587">
-    <w:abstractNumId w:val="11"/>
+    <w:abstractNumId w:val="12"/>
   </w:num>
   <w:num w:numId="14" w16cid:durableId="1542092279">
     <w:abstractNumId w:val="7"/>
+  </w:num>
+  <w:num w:numId="15" w16cid:durableId="851453108">
+    <w:abstractNumId w:val="10"/>
   </w:num>
 </w:numbering>
 </file>

</xml_diff>